<commit_message>
chore: limpia temporales gude-*.log del repo, corrige SCA browserslist y sube cambios de staff/customers/content
- SCA: override browserslist ^4.28.7 en pnpm-workspace.yaml (fix CVE-2025-53960 / GHSA-c83g-rgw3-j3cx + GHSA-73wf-gq98-2v4g) -> audit limpio
- .gitignore: nuevo patron **/gude-*.log (temporales de edicion DaVinci/Paint.NET que se colaban en content/)
- Des-trackea 15 gude-*.log que estaban en git (ya no se suben)
- Elimina .nojekyll (no hay GitHub Pages), opencode.json.bak, query (basura accidental)
- Contenido ciszukoantony/ciszubot: rename contorn->contour, thumbnails nuevos, limpieza temporales
- archives/staff y archives/customers: regeneracion de docs (STAFFCON/CUSTOMERSCON)
- pnpm-lock.yaml actualizado (override browserslist)
</commit_message>
<xml_diff>
--- a/archives/customers/docs/CUSTOMERS_GLOBAL.docx
+++ b/archives/customers/docs/CUSTOMERS_GLOBAL.docx
@@ -393,13 +393,13 @@
       </w:tr>
     </w:tbl>
     <w:bookmarkEnd w:id="10"/>
-    <w:bookmarkStart w:id="11" w:name="historial-de-bajas-0"/>
+    <w:bookmarkStart w:id="11" w:name="historial-de-bajas-1"/>
     <w:p>
       <w:pPr>
         <w:pStyle w:val="Heading2"/>
       </w:pPr>
       <w:r>
-        <w:t xml:space="preserve">3. Historial de bajas (0)</w:t>
+        <w:t xml:space="preserve">3. Historial de bajas (1)</w:t>
       </w:r>
     </w:p>
     <w:tbl>
@@ -483,51 +483,51 @@
               <w:pStyle w:val="Compact"/>
             </w:pPr>
             <w:r>
-              <w:t xml:space="preserve">-</w:t>
-            </w:r>
-          </w:p>
-        </w:tc>
-        <w:tc>
-          <w:tcPr/>
-          <w:p>
-            <w:pPr>
-              <w:pStyle w:val="Compact"/>
-            </w:pPr>
-            <w:r>
-              <w:t xml:space="preserve">(sin bajas registradas)</w:t>
-            </w:r>
-          </w:p>
-        </w:tc>
-        <w:tc>
-          <w:tcPr/>
-          <w:p>
-            <w:pPr>
-              <w:pStyle w:val="Compact"/>
-            </w:pPr>
-            <w:r>
-              <w:t xml:space="preserve">-</w:t>
-            </w:r>
-          </w:p>
-        </w:tc>
-        <w:tc>
-          <w:tcPr/>
-          <w:p>
-            <w:pPr>
-              <w:pStyle w:val="Compact"/>
-            </w:pPr>
-            <w:r>
-              <w:t xml:space="preserve">-</w:t>
-            </w:r>
-          </w:p>
-        </w:tc>
-        <w:tc>
-          <w:tcPr/>
-          <w:p>
-            <w:pPr>
-              <w:pStyle w:val="Compact"/>
-            </w:pPr>
-            <w:r>
-              <w:t xml:space="preserve">-</w:t>
+              <w:t xml:space="preserve">CL-003</w:t>
+            </w:r>
+          </w:p>
+        </w:tc>
+        <w:tc>
+          <w:tcPr/>
+          <w:p>
+            <w:pPr>
+              <w:pStyle w:val="Compact"/>
+            </w:pPr>
+            <w:r>
+              <w:t xml:space="preserve">TESTEO TESTEA</w:t>
+            </w:r>
+          </w:p>
+        </w:tc>
+        <w:tc>
+          <w:tcPr/>
+          <w:p>
+            <w:pPr>
+              <w:pStyle w:val="Compact"/>
+            </w:pPr>
+            <w:r>
+              <w:t xml:space="preserve">test</w:t>
+            </w:r>
+          </w:p>
+        </w:tc>
+        <w:tc>
+          <w:tcPr/>
+          <w:p>
+            <w:pPr>
+              <w:pStyle w:val="Compact"/>
+            </w:pPr>
+            <w:r>
+              <w:t xml:space="preserve">2026-08-26</w:t>
+            </w:r>
+          </w:p>
+        </w:tc>
+        <w:tc>
+          <w:tcPr/>
+          <w:p>
+            <w:pPr>
+              <w:pStyle w:val="Compact"/>
+            </w:pPr>
+            <w:r>
+              <w:t xml:space="preserve">Test</w:t>
             </w:r>
           </w:p>
         </w:tc>

</xml_diff>